<commit_message>
Redesign concept template sections around new Product Concept Template
New template structure (5 sections):
  Cover: Project/Technology name, Lead organisation, Current TRL
  1. Product Snapshot: 1.1 Technology, 1.2 Product (new), 1.2 TRL table, 1.3 IP
  2. Problem & Value Proposition: 2.1 Problem statement, 2.2 Value Proposition (single)
  3–5: Market (TAM/SAM/SOM), Roadmap, Risks — unchanged

types.ts: add project_name, product_description, value_proposition;
  remove value_functional, value_economic, value_strategic, validation

conceptParser.ts: detect dual 1.2 headings (new template: Product + TRL),
  fall back to single 1.2 (old template: TRL only); parse value_proposition
  as single 2.2 field; add project_name from cover label

ConceptTemplatePanel: update EMPTY, FieldKey exclusions and SECTIONS

public/Product_Concept_Template.docx: replaced with new template file

https://claude.ai/code/session_01Wz7NEUzVP4Zx2N7G6eGFg8
</commit_message>
<xml_diff>
--- a/public/Product_Concept_Template.docx
+++ b/public/Product_Concept_Template.docx
@@ -93,12 +93,6 @@
         <w:gridCol w:w="5200"/>
       </w:tblGrid>
       <w:tr>
-        <w:tblPrEx>
-          <w:tblCellMar>
-            <w:top w:w="0" w:type="dxa"/>
-            <w:bottom w:w="0" w:type="dxa"/>
-          </w:tblCellMar>
-        </w:tblPrEx>
         <w:trPr>
           <w:jc w:val="center"/>
         </w:trPr>
@@ -170,12 +164,6 @@
         </w:tc>
       </w:tr>
       <w:tr>
-        <w:tblPrEx>
-          <w:tblCellMar>
-            <w:top w:w="0" w:type="dxa"/>
-            <w:bottom w:w="0" w:type="dxa"/>
-          </w:tblCellMar>
-        </w:tblPrEx>
         <w:trPr>
           <w:jc w:val="center"/>
         </w:trPr>
@@ -277,12 +265,6 @@
         </w:tc>
       </w:tr>
       <w:tr>
-        <w:tblPrEx>
-          <w:tblCellMar>
-            <w:top w:w="0" w:type="dxa"/>
-            <w:bottom w:w="0" w:type="dxa"/>
-          </w:tblCellMar>
-        </w:tblPrEx>
         <w:trPr>
           <w:jc w:val="center"/>
         </w:trPr>
@@ -354,12 +336,6 @@
         </w:tc>
       </w:tr>
       <w:tr>
-        <w:tblPrEx>
-          <w:tblCellMar>
-            <w:top w:w="0" w:type="dxa"/>
-            <w:bottom w:w="0" w:type="dxa"/>
-          </w:tblCellMar>
-        </w:tblPrEx>
         <w:trPr>
           <w:jc w:val="center"/>
         </w:trPr>
@@ -392,7 +368,7 @@
                 <w:bCs/>
                 <w:lang w:val="en-US"/>
               </w:rPr>
-              <w:t>Version</w:t>
+              <w:t>Current TRL</w:t>
             </w:r>
           </w:p>
         </w:tc>
@@ -425,83 +401,6 @@
                 <w:color w:val="595959"/>
                 <w:lang w:val="en-US"/>
               </w:rPr>
-              <w:t>v0.1 — [DD/MM/YYYY]</w:t>
-            </w:r>
-          </w:p>
-        </w:tc>
-      </w:tr>
-      <w:tr>
-        <w:tblPrEx>
-          <w:tblCellMar>
-            <w:top w:w="0" w:type="dxa"/>
-            <w:bottom w:w="0" w:type="dxa"/>
-          </w:tblCellMar>
-        </w:tblPrEx>
-        <w:trPr>
-          <w:jc w:val="center"/>
-        </w:trPr>
-        <w:tc>
-          <w:tcPr>
-            <w:tcW w:w="2800" w:type="dxa"/>
-            <w:tcBorders>
-              <w:top w:val="single" w:sz="4" w:space="0" w:color="BFBFBF"/>
-              <w:left w:val="single" w:sz="4" w:space="0" w:color="BFBFBF"/>
-              <w:bottom w:val="single" w:sz="4" w:space="0" w:color="BFBFBF"/>
-              <w:right w:val="single" w:sz="4" w:space="0" w:color="BFBFBF"/>
-            </w:tcBorders>
-            <w:shd w:val="clear" w:color="auto" w:fill="D9E2F3"/>
-            <w:tcMar>
-              <w:top w:w="100" w:type="dxa"/>
-              <w:left w:w="140" w:type="dxa"/>
-              <w:bottom w:w="100" w:type="dxa"/>
-              <w:right w:w="140" w:type="dxa"/>
-            </w:tcMar>
-          </w:tcPr>
-          <w:p>
-            <w:pPr>
-              <w:rPr>
-                <w:lang w:val="en-US"/>
-              </w:rPr>
-            </w:pPr>
-            <w:r>
-              <w:rPr>
-                <w:b/>
-                <w:bCs/>
-                <w:lang w:val="en-US"/>
-              </w:rPr>
-              <w:t>Current TRL</w:t>
-            </w:r>
-          </w:p>
-        </w:tc>
-        <w:tc>
-          <w:tcPr>
-            <w:tcW w:w="5200" w:type="dxa"/>
-            <w:tcBorders>
-              <w:top w:val="single" w:sz="4" w:space="0" w:color="BFBFBF"/>
-              <w:left w:val="single" w:sz="4" w:space="0" w:color="BFBFBF"/>
-              <w:bottom w:val="single" w:sz="4" w:space="0" w:color="BFBFBF"/>
-              <w:right w:val="single" w:sz="4" w:space="0" w:color="BFBFBF"/>
-            </w:tcBorders>
-            <w:tcMar>
-              <w:top w:w="100" w:type="dxa"/>
-              <w:left w:w="140" w:type="dxa"/>
-              <w:bottom w:w="100" w:type="dxa"/>
-              <w:right w:w="140" w:type="dxa"/>
-            </w:tcMar>
-          </w:tcPr>
-          <w:p>
-            <w:pPr>
-              <w:rPr>
-                <w:lang w:val="en-US"/>
-              </w:rPr>
-            </w:pPr>
-            <w:r>
-              <w:rPr>
-                <w:i/>
-                <w:iCs/>
-                <w:color w:val="595959"/>
-                <w:lang w:val="en-US"/>
-              </w:rPr>
               <w:t>[TRL X]</w:t>
             </w:r>
           </w:p>
@@ -539,7 +438,19 @@
         <w:rPr>
           <w:lang w:val="en-US"/>
         </w:rPr>
-        <w:t>. Technology Snapshot</w:t>
+        <w:t xml:space="preserve">. </w:t>
+      </w:r>
+      <w:r>
+        <w:rPr>
+          <w:lang w:val="en-US"/>
+        </w:rPr>
+        <w:t>Product</w:t>
+      </w:r>
+      <w:r>
+        <w:rPr>
+          <w:lang w:val="en-US"/>
+        </w:rPr>
+        <w:t xml:space="preserve"> Snapshot</w:t>
       </w:r>
     </w:p>
     <w:p>
@@ -559,24 +470,94 @@
         <w:rPr>
           <w:lang w:val="en-US"/>
         </w:rPr>
-        <w:t>.1 Description and novelty</w:t>
+        <w:t xml:space="preserve">.1 </w:t>
+      </w:r>
+      <w:r>
+        <w:rPr>
+          <w:lang w:val="en-US"/>
+        </w:rPr>
+        <w:t>Technology</w:t>
       </w:r>
     </w:p>
     <w:p>
       <w:pPr>
         <w:spacing w:after="160" w:line="300" w:lineRule="auto"/>
-        <w:rPr>
-          <w:lang w:val="en-US"/>
-        </w:rPr>
-      </w:pPr>
-      <w:r>
         <w:rPr>
           <w:i/>
           <w:iCs/>
           <w:color w:val="595959"/>
           <w:lang w:val="en-US"/>
         </w:rPr>
-        <w:t>Briefly describe the scientific principle and the underlying mechanism. State clearly what is novel and why it could not be done before (max 10–15 lines).</w:t>
+      </w:pPr>
+      <w:r>
+        <w:rPr>
+          <w:i/>
+          <w:iCs/>
+          <w:color w:val="595959"/>
+          <w:lang w:val="en-US"/>
+        </w:rPr>
+        <w:t xml:space="preserve">Briefly describe the scientific principle and the underlying mechanism. State clearly what is </w:t>
+      </w:r>
+      <w:r>
+        <w:rPr>
+          <w:i/>
+          <w:iCs/>
+          <w:color w:val="595959"/>
+          <w:lang w:val="en-US"/>
+        </w:rPr>
+        <w:t xml:space="preserve">novel </w:t>
+      </w:r>
+      <w:r>
+        <w:rPr>
+          <w:i/>
+          <w:iCs/>
+          <w:color w:val="595959"/>
+          <w:lang w:val="en-US"/>
+        </w:rPr>
+        <w:t>(max 10–15 lines).</w:t>
+      </w:r>
+    </w:p>
+    <w:p>
+      <w:pPr>
+        <w:pStyle w:val="Titolo2"/>
+        <w:rPr>
+          <w:lang w:val="en-US"/>
+        </w:rPr>
+      </w:pPr>
+      <w:r>
+        <w:rPr>
+          <w:lang w:val="en-US"/>
+        </w:rPr>
+        <w:t>1.2 Product</w:t>
+      </w:r>
+    </w:p>
+    <w:p>
+      <w:pPr>
+        <w:spacing w:after="160" w:line="300" w:lineRule="auto"/>
+        <w:rPr>
+          <w:i/>
+          <w:iCs/>
+          <w:color w:val="595959"/>
+          <w:lang w:val="en-US"/>
+        </w:rPr>
+      </w:pPr>
+      <w:r>
+        <w:rPr>
+          <w:i/>
+          <w:iCs/>
+          <w:color w:val="595959"/>
+          <w:lang w:val="en-US"/>
+        </w:rPr>
+        <w:t>Briefly describe the intended product</w:t>
+      </w:r>
+      <w:r>
+        <w:rPr>
+          <w:i/>
+          <w:iCs/>
+          <w:color w:val="595959"/>
+          <w:lang w:val="en-US"/>
+        </w:rPr>
+        <w:t xml:space="preserve"> (what it is, how it would work, the high-level benefits that could bring).</w:t>
       </w:r>
     </w:p>
     <w:p>
@@ -621,12 +602,6 @@
         <w:gridCol w:w="7160"/>
       </w:tblGrid>
       <w:tr>
-        <w:tblPrEx>
-          <w:tblCellMar>
-            <w:top w:w="0" w:type="dxa"/>
-            <w:bottom w:w="0" w:type="dxa"/>
-          </w:tblCellMar>
-        </w:tblPrEx>
         <w:tc>
           <w:tcPr>
             <w:tcW w:w="2200" w:type="dxa"/>
@@ -695,12 +670,6 @@
         </w:tc>
       </w:tr>
       <w:tr>
-        <w:tblPrEx>
-          <w:tblCellMar>
-            <w:top w:w="0" w:type="dxa"/>
-            <w:bottom w:w="0" w:type="dxa"/>
-          </w:tblCellMar>
-        </w:tblPrEx>
         <w:tc>
           <w:tcPr>
             <w:tcW w:w="2200" w:type="dxa"/>
@@ -769,12 +738,6 @@
         </w:tc>
       </w:tr>
       <w:tr>
-        <w:tblPrEx>
-          <w:tblCellMar>
-            <w:top w:w="0" w:type="dxa"/>
-            <w:bottom w:w="0" w:type="dxa"/>
-          </w:tblCellMar>
-        </w:tblPrEx>
         <w:tc>
           <w:tcPr>
             <w:tcW w:w="2200" w:type="dxa"/>
@@ -843,12 +806,6 @@
         </w:tc>
       </w:tr>
       <w:tr>
-        <w:tblPrEx>
-          <w:tblCellMar>
-            <w:top w:w="0" w:type="dxa"/>
-            <w:bottom w:w="0" w:type="dxa"/>
-          </w:tblCellMar>
-        </w:tblPrEx>
         <w:tc>
           <w:tcPr>
             <w:tcW w:w="2200" w:type="dxa"/>
@@ -939,11 +896,6 @@
     </w:p>
     <w:p>
       <w:pPr>
-        <w:pStyle w:val="Paragrafoelenco"/>
-        <w:numPr>
-          <w:ilvl w:val="0"/>
-          <w:numId w:val="2"/>
-        </w:numPr>
         <w:spacing w:after="60" w:line="300" w:lineRule="auto"/>
         <w:rPr>
           <w:lang w:val="en-US"/>
@@ -996,7 +948,19 @@
         <w:rPr>
           <w:lang w:val="en-US"/>
         </w:rPr>
-        <w:t>.1 Problem statement</w:t>
+        <w:t xml:space="preserve">.1 </w:t>
+      </w:r>
+      <w:r>
+        <w:rPr>
+          <w:lang w:val="en-US"/>
+        </w:rPr>
+        <w:t xml:space="preserve">Application Scenario - </w:t>
+      </w:r>
+      <w:r>
+        <w:rPr>
+          <w:lang w:val="en-US"/>
+        </w:rPr>
+        <w:t>Problem statement</w:t>
       </w:r>
     </w:p>
     <w:p>
@@ -1033,42 +997,24 @@
         <w:rPr>
           <w:lang w:val="en-US"/>
         </w:rPr>
-        <w:t>.2 Value proposition</w:t>
+        <w:t xml:space="preserve">.2 </w:t>
+      </w:r>
+      <w:r>
+        <w:rPr>
+          <w:lang w:val="en-US"/>
+        </w:rPr>
+        <w:t>Application Scenario – Value Proposition</w:t>
       </w:r>
     </w:p>
     <w:p>
       <w:pPr>
-        <w:pStyle w:val="Paragrafoelenco"/>
-        <w:numPr>
-          <w:ilvl w:val="0"/>
-          <w:numId w:val="2"/>
-        </w:numPr>
-        <w:spacing w:after="60" w:line="300" w:lineRule="auto"/>
-        <w:rPr>
-          <w:lang w:val="en-US"/>
-        </w:rPr>
-      </w:pPr>
-      <w:r>
+        <w:spacing w:after="160" w:line="300" w:lineRule="auto"/>
         <w:rPr>
           <w:i/>
           <w:iCs/>
           <w:color w:val="595959"/>
           <w:lang w:val="en-US"/>
         </w:rPr>
-        <w:t>Functional benefits: what the product does better.</w:t>
-      </w:r>
-    </w:p>
-    <w:p>
-      <w:pPr>
-        <w:pStyle w:val="Paragrafoelenco"/>
-        <w:numPr>
-          <w:ilvl w:val="0"/>
-          <w:numId w:val="2"/>
-        </w:numPr>
-        <w:spacing w:after="60" w:line="300" w:lineRule="auto"/>
-        <w:rPr>
-          <w:lang w:val="en-US"/>
-        </w:rPr>
       </w:pPr>
       <w:r>
         <w:rPr>
@@ -1077,21 +1023,8 @@
           <w:color w:val="595959"/>
           <w:lang w:val="en-US"/>
         </w:rPr>
-        <w:t>Economic benefits: cost savings, productivity, revenue uplift.</w:t>
-      </w:r>
-    </w:p>
-    <w:p>
-      <w:pPr>
-        <w:pStyle w:val="Paragrafoelenco"/>
-        <w:numPr>
-          <w:ilvl w:val="0"/>
-          <w:numId w:val="2"/>
-        </w:numPr>
-        <w:spacing w:after="60" w:line="300" w:lineRule="auto"/>
-        <w:rPr>
-          <w:lang w:val="en-US"/>
-        </w:rPr>
-      </w:pPr>
+        <w:t>Show how the application scenario would change with the product</w:t>
+      </w:r>
       <w:r>
         <w:rPr>
           <w:i/>
@@ -1099,63 +1032,7 @@
           <w:color w:val="595959"/>
           <w:lang w:val="en-US"/>
         </w:rPr>
-        <w:t>Strategic benefits: compliance, sustainability, differentiation.</w:t>
-      </w:r>
-    </w:p>
-    <w:p>
-      <w:pPr>
-        <w:pStyle w:val="Titolo2"/>
-        <w:rPr>
-          <w:lang w:val="en-US"/>
-        </w:rPr>
-      </w:pPr>
-      <w:r>
-        <w:rPr>
-          <w:lang w:val="en-US"/>
-        </w:rPr>
-        <w:t>2.3 Validation</w:t>
-      </w:r>
-    </w:p>
-    <w:p>
-      <w:pPr>
-        <w:pStyle w:val="Paragrafoelenco"/>
-        <w:numPr>
-          <w:ilvl w:val="0"/>
-          <w:numId w:val="2"/>
-        </w:numPr>
-        <w:spacing w:after="60" w:line="300" w:lineRule="auto"/>
-        <w:rPr>
-          <w:lang w:val="en-US"/>
-        </w:rPr>
-      </w:pPr>
-      <w:r>
-        <w:rPr>
-          <w:i/>
-          <w:iCs/>
-          <w:color w:val="595959"/>
-          <w:lang w:val="en-US"/>
-        </w:rPr>
-        <w:t xml:space="preserve">Evidence of </w:t>
-      </w:r>
-      <w:proofErr w:type="spellStart"/>
-      <w:r>
-        <w:rPr>
-          <w:i/>
-          <w:iCs/>
-          <w:color w:val="595959"/>
-          <w:lang w:val="en-US"/>
-        </w:rPr>
-        <w:t>probem</w:t>
-      </w:r>
-      <w:proofErr w:type="spellEnd"/>
-      <w:r>
-        <w:rPr>
-          <w:i/>
-          <w:iCs/>
-          <w:color w:val="595959"/>
-          <w:lang w:val="en-US"/>
-        </w:rPr>
-        <w:t>/solution validation</w:t>
+        <w:t>.</w:t>
       </w:r>
     </w:p>
     <w:p>
@@ -1221,12 +1098,6 @@
         <w:gridCol w:w="1800"/>
       </w:tblGrid>
       <w:tr>
-        <w:tblPrEx>
-          <w:tblCellMar>
-            <w:top w:w="0" w:type="dxa"/>
-            <w:bottom w:w="0" w:type="dxa"/>
-          </w:tblCellMar>
-        </w:tblPrEx>
         <w:trPr>
           <w:tblHeader/>
         </w:trPr>
@@ -1334,12 +1205,6 @@
         </w:tc>
       </w:tr>
       <w:tr>
-        <w:tblPrEx>
-          <w:tblCellMar>
-            <w:top w:w="0" w:type="dxa"/>
-            <w:bottom w:w="0" w:type="dxa"/>
-          </w:tblCellMar>
-        </w:tblPrEx>
         <w:tc>
           <w:tcPr>
             <w:tcW w:w="1800" w:type="dxa"/>
@@ -1441,12 +1306,6 @@
         </w:tc>
       </w:tr>
       <w:tr>
-        <w:tblPrEx>
-          <w:tblCellMar>
-            <w:top w:w="0" w:type="dxa"/>
-            <w:bottom w:w="0" w:type="dxa"/>
-          </w:tblCellMar>
-        </w:tblPrEx>
         <w:tc>
           <w:tcPr>
             <w:tcW w:w="1800" w:type="dxa"/>
@@ -1548,12 +1407,6 @@
         </w:tc>
       </w:tr>
       <w:tr>
-        <w:tblPrEx>
-          <w:tblCellMar>
-            <w:top w:w="0" w:type="dxa"/>
-            <w:bottom w:w="0" w:type="dxa"/>
-          </w:tblCellMar>
-        </w:tblPrEx>
         <w:tc>
           <w:tcPr>
             <w:tcW w:w="1800" w:type="dxa"/>
@@ -1583,7 +1436,6 @@
                 <w:bCs/>
                 <w:lang w:val="en-US"/>
               </w:rPr>
-              <w:lastRenderedPageBreak/>
               <w:t>SOM</w:t>
             </w:r>
           </w:p>
@@ -1667,6 +1519,7 @@
         <w:rPr>
           <w:lang w:val="en-US"/>
         </w:rPr>
+        <w:lastRenderedPageBreak/>
         <w:t>4</w:t>
       </w:r>
       <w:r>
@@ -1737,12 +1590,6 @@
         <w:gridCol w:w="3120"/>
       </w:tblGrid>
       <w:tr>
-        <w:tblPrEx>
-          <w:tblCellMar>
-            <w:top w:w="0" w:type="dxa"/>
-            <w:bottom w:w="0" w:type="dxa"/>
-          </w:tblCellMar>
-        </w:tblPrEx>
         <w:trPr>
           <w:tblHeader/>
         </w:trPr>
@@ -1884,12 +1731,6 @@
         </w:tc>
       </w:tr>
       <w:tr>
-        <w:tblPrEx>
-          <w:tblCellMar>
-            <w:top w:w="0" w:type="dxa"/>
-            <w:bottom w:w="0" w:type="dxa"/>
-          </w:tblCellMar>
-        </w:tblPrEx>
         <w:tc>
           <w:tcPr>
             <w:tcW w:w="1560" w:type="dxa"/>
@@ -2024,12 +1865,6 @@
         </w:tc>
       </w:tr>
       <w:tr>
-        <w:tblPrEx>
-          <w:tblCellMar>
-            <w:top w:w="0" w:type="dxa"/>
-            <w:bottom w:w="0" w:type="dxa"/>
-          </w:tblCellMar>
-        </w:tblPrEx>
         <w:tc>
           <w:tcPr>
             <w:tcW w:w="1560" w:type="dxa"/>
@@ -2164,12 +1999,6 @@
         </w:tc>
       </w:tr>
       <w:tr>
-        <w:tblPrEx>
-          <w:tblCellMar>
-            <w:top w:w="0" w:type="dxa"/>
-            <w:bottom w:w="0" w:type="dxa"/>
-          </w:tblCellMar>
-        </w:tblPrEx>
         <w:tc>
           <w:tcPr>
             <w:tcW w:w="1560" w:type="dxa"/>
@@ -2370,21 +2199,8 @@
           <w:color w:val="595959"/>
           <w:lang w:val="en-US"/>
         </w:rPr>
-        <w:t>List the 3–5 assumptions whose falsification would invalidate the concept, and the experiments / pilots designed to test them.</w:t>
-      </w:r>
-    </w:p>
-    <w:p>
-      <w:pPr>
-        <w:pStyle w:val="Paragrafoelenco"/>
-        <w:numPr>
-          <w:ilvl w:val="0"/>
-          <w:numId w:val="2"/>
-        </w:numPr>
-        <w:spacing w:after="60" w:line="300" w:lineRule="auto"/>
-        <w:rPr>
-          <w:lang w:val="en-US"/>
-        </w:rPr>
-      </w:pPr>
+        <w:t>List the 3–5 assumptions whose falsification would invalidate the concept</w:t>
+      </w:r>
       <w:r>
         <w:rPr>
           <w:i/>
@@ -2392,51 +2208,7 @@
           <w:color w:val="595959"/>
           <w:lang w:val="en-US"/>
         </w:rPr>
-        <w:t>Assumption 1 → experiment / pilot → kill-criterion.</w:t>
-      </w:r>
-    </w:p>
-    <w:p>
-      <w:pPr>
-        <w:pStyle w:val="Paragrafoelenco"/>
-        <w:numPr>
-          <w:ilvl w:val="0"/>
-          <w:numId w:val="2"/>
-        </w:numPr>
-        <w:spacing w:after="60" w:line="300" w:lineRule="auto"/>
-        <w:rPr>
-          <w:lang w:val="en-US"/>
-        </w:rPr>
-      </w:pPr>
-      <w:r>
-        <w:rPr>
-          <w:i/>
-          <w:iCs/>
-          <w:color w:val="595959"/>
-          <w:lang w:val="en-US"/>
-        </w:rPr>
-        <w:t>Assumption 2 → experiment / pilot → kill-criterion.</w:t>
-      </w:r>
-    </w:p>
-    <w:p>
-      <w:pPr>
-        <w:pStyle w:val="Paragrafoelenco"/>
-        <w:numPr>
-          <w:ilvl w:val="0"/>
-          <w:numId w:val="2"/>
-        </w:numPr>
-        <w:spacing w:after="60" w:line="300" w:lineRule="auto"/>
-        <w:rPr>
-          <w:lang w:val="en-US"/>
-        </w:rPr>
-      </w:pPr>
-      <w:r>
-        <w:rPr>
-          <w:i/>
-          <w:iCs/>
-          <w:color w:val="595959"/>
-          <w:lang w:val="en-US"/>
-        </w:rPr>
-        <w:t>Assumption 3 → experiment / pilot → kill-criterion.</w:t>
+        <w:t>.</w:t>
       </w:r>
     </w:p>
     <w:p>
@@ -3410,6 +3182,48 @@
       <w:szCs w:val="20"/>
     </w:rPr>
   </w:style>
+  <w:style w:type="paragraph" w:styleId="Intestazione">
+    <w:name w:val="header"/>
+    <w:basedOn w:val="Normale"/>
+    <w:link w:val="IntestazioneCarattere"/>
+    <w:uiPriority w:val="99"/>
+    <w:unhideWhenUsed/>
+    <w:rsid w:val="0073683E"/>
+    <w:pPr>
+      <w:tabs>
+        <w:tab w:val="center" w:pos="4819"/>
+        <w:tab w:val="right" w:pos="9638"/>
+      </w:tabs>
+    </w:pPr>
+  </w:style>
+  <w:style w:type="character" w:customStyle="1" w:styleId="IntestazioneCarattere">
+    <w:name w:val="Intestazione Carattere"/>
+    <w:basedOn w:val="Carpredefinitoparagrafo"/>
+    <w:link w:val="Intestazione"/>
+    <w:uiPriority w:val="99"/>
+    <w:rsid w:val="0073683E"/>
+  </w:style>
+  <w:style w:type="paragraph" w:styleId="Pidipagina">
+    <w:name w:val="footer"/>
+    <w:basedOn w:val="Normale"/>
+    <w:link w:val="PidipaginaCarattere"/>
+    <w:uiPriority w:val="99"/>
+    <w:unhideWhenUsed/>
+    <w:rsid w:val="0073683E"/>
+    <w:pPr>
+      <w:tabs>
+        <w:tab w:val="center" w:pos="4819"/>
+        <w:tab w:val="right" w:pos="9638"/>
+      </w:tabs>
+    </w:pPr>
+  </w:style>
+  <w:style w:type="character" w:customStyle="1" w:styleId="PidipaginaCarattere">
+    <w:name w:val="Piè di pagina Carattere"/>
+    <w:basedOn w:val="Carpredefinitoparagrafo"/>
+    <w:link w:val="Pidipagina"/>
+    <w:uiPriority w:val="99"/>
+    <w:rsid w:val="0073683E"/>
+  </w:style>
 </w:styles>
 </file>
 

</xml_diff>

<commit_message>
chore: update Product Concept Template to corrected version
Fixes section numbering: 1.2 Product, 1.3 Current TRL, 1.4 IP.

https://claude.ai/code/session_01Wz7NEUzVP4Zx2N7G6eGFg8
</commit_message>
<xml_diff>
--- a/public/Product_Concept_Template.docx
+++ b/public/Product_Concept_Template.docx
@@ -577,7 +577,19 @@
         <w:rPr>
           <w:lang w:val="en-US"/>
         </w:rPr>
-        <w:t>.2 Current TRL and evidence</w:t>
+        <w:t>.</w:t>
+      </w:r>
+      <w:r>
+        <w:rPr>
+          <w:lang w:val="en-US"/>
+        </w:rPr>
+        <w:t>3</w:t>
+      </w:r>
+      <w:r>
+        <w:rPr>
+          <w:lang w:val="en-US"/>
+        </w:rPr>
+        <w:t xml:space="preserve"> Current TRL and evidence</w:t>
       </w:r>
     </w:p>
     <w:tbl>
@@ -891,7 +903,19 @@
         <w:rPr>
           <w:lang w:val="en-US"/>
         </w:rPr>
-        <w:t>.3 Intellectual property</w:t>
+        <w:t>.</w:t>
+      </w:r>
+      <w:r>
+        <w:rPr>
+          <w:lang w:val="en-US"/>
+        </w:rPr>
+        <w:t>4</w:t>
+      </w:r>
+      <w:r>
+        <w:rPr>
+          <w:lang w:val="en-US"/>
+        </w:rPr>
+        <w:t xml:space="preserve"> Intellectual property</w:t>
       </w:r>
     </w:p>
     <w:p>

</xml_diff>